<commit_message>
Despliegues de lo de evidencia
</commit_message>
<xml_diff>
--- a/App/plantillas/etiqueta.docx
+++ b/App/plantillas/etiqueta.docx
@@ -1,100 +1,74 @@
 
 <file path=word/document.xml><?xml version="1.0" encoding="utf-8"?>
-<w:document xmlns:o="urn:schemas-microsoft-com:office:office" xmlns:r="http://schemas.openxmlformats.org/officeDocument/2006/relationships" xmlns:v="urn:schemas-microsoft-com:vml" xmlns:w="http://schemas.openxmlformats.org/wordprocessingml/2006/main" xmlns:w10="urn:schemas-microsoft-com:office:word" xmlns:wp="http://schemas.openxmlformats.org/drawingml/2006/wordprocessingDrawing" xmlns:wps="http://schemas.microsoft.com/office/word/2010/wordprocessingShape" xmlns:wpg="http://schemas.microsoft.com/office/word/2010/wordprocessingGroup" xmlns:mc="http://schemas.openxmlformats.org/markup-compatibility/2006" xmlns:wp14="http://schemas.microsoft.com/office/word/2010/wordprocessingDrawing" xmlns:w14="http://schemas.microsoft.com/office/word/2010/wordml" xmlns:w15="http://schemas.microsoft.com/office/word/2012/wordml" mc:Ignorable="w14 wp14 w15">
+<w:document xmlns:wpc="http://schemas.microsoft.com/office/word/2010/wordprocessingCanvas" xmlns:cx="http://schemas.microsoft.com/office/drawing/2014/chartex" xmlns:cx1="http://schemas.microsoft.com/office/drawing/2015/9/8/chartex" xmlns:cx2="http://schemas.microsoft.com/office/drawing/2015/10/21/chartex" xmlns:cx3="http://schemas.microsoft.com/office/drawing/2016/5/9/chartex" xmlns:cx4="http://schemas.microsoft.com/office/drawing/2016/5/10/chartex" xmlns:cx5="http://schemas.microsoft.com/office/drawing/2016/5/11/chartex" xmlns:cx6="http://schemas.microsoft.com/office/drawing/2016/5/12/chartex" xmlns:cx7="http://schemas.microsoft.com/office/drawing/2016/5/13/chartex" xmlns:cx8="http://schemas.microsoft.com/office/drawing/2016/5/14/chartex" xmlns:mc="http://schemas.openxmlformats.org/markup-compatibility/2006" xmlns:aink="http://schemas.microsoft.com/office/drawing/2016/ink" xmlns:am3d="http://schemas.microsoft.com/office/drawing/2017/model3d" xmlns:o="urn:schemas-microsoft-com:office:office" xmlns:oel="http://schemas.microsoft.com/office/2019/extlst" xmlns:r="http://schemas.openxmlformats.org/officeDocument/2006/relationships" xmlns:m="http://schemas.openxmlformats.org/officeDocument/2006/math" xmlns:v="urn:schemas-microsoft-com:vml" xmlns:wp14="http://schemas.microsoft.com/office/word/2010/wordprocessingDrawing" xmlns:wp="http://schemas.openxmlformats.org/drawingml/2006/wordprocessingDrawing" xmlns:w10="urn:schemas-microsoft-com:office:word" xmlns:w="http://schemas.openxmlformats.org/wordprocessingml/2006/main" xmlns:w14="http://schemas.microsoft.com/office/word/2010/wordml" xmlns:w15="http://schemas.microsoft.com/office/word/2012/wordml" xmlns:w16cex="http://schemas.microsoft.com/office/word/2018/wordml/cex" xmlns:w16cid="http://schemas.microsoft.com/office/word/2016/wordml/cid" xmlns:w16="http://schemas.microsoft.com/office/word/2018/wordml" xmlns:w16du="http://schemas.microsoft.com/office/word/2023/wordml/word16du" xmlns:w16sdtdh="http://schemas.microsoft.com/office/word/2020/wordml/sdtdatahash" xmlns:w16sdtfl="http://schemas.microsoft.com/office/word/2024/wordml/sdtformatlock" xmlns:w16se="http://schemas.microsoft.com/office/word/2015/wordml/symex" xmlns:wpg="http://schemas.microsoft.com/office/word/2010/wordprocessingGroup" xmlns:wpi="http://schemas.microsoft.com/office/word/2010/wordprocessingInk" xmlns:wne="http://schemas.microsoft.com/office/word/2006/wordml" xmlns:wps="http://schemas.microsoft.com/office/word/2010/wordprocessingShape" mc:Ignorable="w14 w15 w16se w16cid w16 w16cex w16sdtdh w16sdtfl w16du wp14">
   <w:body>
     <w:p>
       <w:pPr>
-        <w:pStyle w:val="Normal"/>
         <w:rPr>
+          <w:u w:val="single"/>
           <w:lang w:val="es-ES"/>
         </w:rPr>
       </w:pPr>
-      <w:r>
-        <w:rPr>
-          <w:lang w:val="es-ES"/>
-        </w:rPr>
-      </w:r>
     </w:p>
     <w:tbl>
       <w:tblPr>
         <w:tblStyle w:val="Tablaconcuadrcula"/>
-        <w:tblpPr w:vertAnchor="text" w:horzAnchor="margin" w:leftFromText="141" w:rightFromText="141" w:tblpX="0" w:tblpY="-49"/>
+        <w:tblpPr w:leftFromText="141" w:rightFromText="141" w:vertAnchor="text" w:horzAnchor="margin" w:tblpY="-49"/>
         <w:tblW w:w="14390" w:type="dxa"/>
-        <w:jc w:val="left"/>
-        <w:tblInd w:w="-5" w:type="dxa"/>
         <w:tblLayout w:type="fixed"/>
-        <w:tblCellMar>
-          <w:top w:w="0" w:type="dxa"/>
-          <w:left w:w="108" w:type="dxa"/>
-          <w:bottom w:w="0" w:type="dxa"/>
-          <w:right w:w="108" w:type="dxa"/>
-        </w:tblCellMar>
-        <w:tblLook w:firstRow="1" w:noVBand="1" w:lastRow="0" w:firstColumn="1" w:lastColumn="0" w:noHBand="0" w:val="04a0"/>
+        <w:tblLook w:val="04A0" w:firstRow="1" w:lastRow="0" w:firstColumn="1" w:lastColumn="0" w:noHBand="0" w:noVBand="1"/>
       </w:tblPr>
       <w:tblGrid>
         <w:gridCol w:w="5987"/>
-        <w:gridCol w:w="8402"/>
+        <w:gridCol w:w="8403"/>
       </w:tblGrid>
       <w:tr>
         <w:trPr>
-          <w:trHeight w:val="699" w:hRule="atLeast"/>
+          <w:trHeight w:val="699"/>
         </w:trPr>
         <w:tc>
           <w:tcPr>
             <w:tcW w:w="14389" w:type="dxa"/>
             <w:gridSpan w:val="2"/>
-            <w:tcBorders/>
           </w:tcPr>
           <w:p>
             <w:pPr>
-              <w:pStyle w:val="Normal"/>
-              <w:widowControl/>
-              <w:tabs>
-                <w:tab w:val="clear" w:pos="708"/>
-                <w:tab w:val="left" w:pos="5771" w:leader="none"/>
-              </w:tabs>
-              <w:spacing w:before="0" w:after="0"/>
+              <w:tabs>
+                <w:tab w:val="left" w:pos="5771"/>
+              </w:tabs>
               <w:jc w:val="center"/>
               <w:rPr>
-                <w:rFonts w:ascii="Calibri" w:hAnsi="Calibri" w:eastAsia="Calibri" w:cs=""/>
-                <w:kern w:val="2"/>
+                <w:rFonts w:ascii="Calibri" w:eastAsia="Calibri" w:hAnsi="Calibri"/>
                 <w:sz w:val="64"/>
                 <w:szCs w:val="64"/>
-                <w:lang w:val="es-CO" w:eastAsia="en-US" w:bidi="ar-SA"/>
-              </w:rPr>
-            </w:pPr>
-            <w:r>
-              <w:rPr>
-                <w:rFonts w:eastAsia="Calibri" w:cs="Arial" w:ascii="Arial" w:hAnsi="Arial"/>
-                <w:kern w:val="2"/>
+              </w:rPr>
+            </w:pPr>
+            <w:r>
+              <w:rPr>
+                <w:rFonts w:ascii="Arial" w:eastAsia="Calibri" w:hAnsi="Arial" w:cs="Arial"/>
                 <w:sz w:val="64"/>
                 <w:szCs w:val="64"/>
-                <w:lang w:val="es-ES" w:eastAsia="en-US" w:bidi="ar-SA"/>
-              </w:rPr>
-              <w:t>SUMINISTROS FERRETEROS DEL ORIENTE</w:t>
+                <w:lang w:val="es-ES"/>
+              </w:rPr>
+              <w:t>LABORATORIOS UNIDOS</w:t>
             </w:r>
           </w:p>
         </w:tc>
       </w:tr>
       <w:tr>
         <w:trPr>
-          <w:trHeight w:val="551" w:hRule="atLeast"/>
+          <w:trHeight w:val="551"/>
         </w:trPr>
         <w:tc>
           <w:tcPr>
             <w:tcW w:w="5987" w:type="dxa"/>
             <w:vMerge w:val="restart"/>
-            <w:tcBorders/>
           </w:tcPr>
           <w:p>
             <w:pPr>
-              <w:pStyle w:val="Normal"/>
-              <w:widowControl/>
-              <w:tabs>
-                <w:tab w:val="clear" w:pos="708"/>
-                <w:tab w:val="left" w:pos="5771" w:leader="none"/>
-              </w:tabs>
-              <w:spacing w:before="0" w:after="0"/>
+              <w:tabs>
+                <w:tab w:val="left" w:pos="5771"/>
+              </w:tabs>
               <w:jc w:val="center"/>
               <w:rPr>
                 <w:lang w:val="es-ES"/>
@@ -102,41 +76,14 @@
             </w:pPr>
             <w:r>
               <w:rPr>
-                <w:rFonts w:eastAsia="Calibri" w:cs=""/>
-                <w:kern w:val="2"/>
-                <w:sz w:val="24"/>
-                <w:szCs w:val="24"/>
-                <w:lang w:val="es-ES" w:eastAsia="en-US" w:bidi="ar-SA"/>
-              </w:rPr>
-            </w:r>
-          </w:p>
-          <w:p>
-            <w:pPr>
-              <w:pStyle w:val="Normal"/>
-              <w:widowControl/>
-              <w:tabs>
-                <w:tab w:val="clear" w:pos="708"/>
-                <w:tab w:val="left" w:pos="5771" w:leader="none"/>
-              </w:tabs>
-              <w:spacing w:before="0" w:after="0"/>
-              <w:jc w:val="center"/>
-              <w:rPr>
-                <w:lang w:val="es-ES"/>
-              </w:rPr>
-            </w:pPr>
-            <w:r>
-              <w:rPr>
-                <w:rFonts w:eastAsia="Calibri" w:cs=""/>
-                <w:kern w:val="2"/>
-                <w:sz w:val="24"/>
-                <w:szCs w:val="24"/>
-                <w:lang w:eastAsia="en-US" w:bidi="ar-SA"/>
+                <w:rFonts w:eastAsia="Calibri"/>
+                <w:noProof/>
               </w:rPr>
               <w:drawing>
-                <wp:inline distT="0" distB="0" distL="0" distR="0">
-                  <wp:extent cx="3586480" cy="1375410"/>
+                <wp:inline distT="0" distB="0" distL="0" distR="0" wp14:anchorId="3ACFD082" wp14:editId="1F9CD571">
+                  <wp:extent cx="2987040" cy="2387730"/>
                   <wp:effectExtent l="0" t="0" r="0" b="0"/>
-                  <wp:docPr id="1" name="Imagen 2" descr=""/>
+                  <wp:docPr id="744438056" name="Imagen 2"/>
                   <wp:cNvGraphicFramePr>
                     <a:graphicFrameLocks xmlns:a="http://schemas.openxmlformats.org/drawingml/2006/main" noChangeAspect="1"/>
                   </wp:cNvGraphicFramePr>
@@ -144,14 +91,20 @@
                     <a:graphicData uri="http://schemas.openxmlformats.org/drawingml/2006/picture">
                       <pic:pic xmlns:pic="http://schemas.openxmlformats.org/drawingml/2006/picture">
                         <pic:nvPicPr>
-                          <pic:cNvPr id="1" name="Imagen 2" descr=""/>
+                          <pic:cNvPr id="0" name="Picture 2"/>
                           <pic:cNvPicPr>
                             <a:picLocks noChangeAspect="1" noChangeArrowheads="1"/>
                           </pic:cNvPicPr>
                         </pic:nvPicPr>
                         <pic:blipFill>
-                          <a:blip r:embed="rId2"/>
-                          <a:srcRect l="10649" t="35500" r="11612" b="34692"/>
+                          <a:blip r:embed="rId4">
+                            <a:extLst>
+                              <a:ext uri="{28A0092B-C50C-407E-A947-70E740481C1C}">
+                                <a14:useLocalDpi xmlns:a14="http://schemas.microsoft.com/office/drawing/2010/main" val="0"/>
+                              </a:ext>
+                            </a:extLst>
+                          </a:blip>
+                          <a:srcRect/>
                           <a:stretch>
                             <a:fillRect/>
                           </a:stretch>
@@ -159,11 +112,15 @@
                         <pic:spPr bwMode="auto">
                           <a:xfrm>
                             <a:off x="0" y="0"/>
-                            <a:ext cx="3586480" cy="1375410"/>
+                            <a:ext cx="2996220" cy="2395068"/>
                           </a:xfrm>
                           <a:prstGeom prst="rect">
                             <a:avLst/>
                           </a:prstGeom>
+                          <a:noFill/>
+                          <a:ln>
+                            <a:noFill/>
+                          </a:ln>
                         </pic:spPr>
                       </pic:pic>
                     </a:graphicData>
@@ -176,18 +133,12 @@
         <w:tc>
           <w:tcPr>
             <w:tcW w:w="8402" w:type="dxa"/>
-            <w:tcBorders/>
           </w:tcPr>
           <w:p>
             <w:pPr>
-              <w:pStyle w:val="Normal"/>
-              <w:widowControl/>
-              <w:tabs>
-                <w:tab w:val="clear" w:pos="708"/>
-                <w:tab w:val="left" w:pos="5771" w:leader="none"/>
-              </w:tabs>
-              <w:spacing w:before="0" w:after="0"/>
-              <w:jc w:val="left"/>
+              <w:tabs>
+                <w:tab w:val="left" w:pos="5771"/>
+              </w:tabs>
               <w:rPr>
                 <w:rFonts w:ascii="Arial" w:hAnsi="Arial" w:cs="Arial"/>
                 <w:sz w:val="44"/>
@@ -197,25 +148,39 @@
             </w:pPr>
             <w:r>
               <w:rPr>
-                <w:rFonts w:eastAsia="Calibri" w:cs="Arial" w:ascii="Arial" w:hAnsi="Arial"/>
-                <w:kern w:val="2"/>
-                <w:sz w:val="44"/>
-                <w:szCs w:val="44"/>
-                <w:lang w:val="es-ES" w:eastAsia="en-US" w:bidi="ar-SA"/>
-              </w:rPr>
-              <w:t>${cliente_nombre}</w:t>
-            </w:r>
-          </w:p>
-          <w:p>
-            <w:pPr>
-              <w:pStyle w:val="Normal"/>
-              <w:widowControl/>
-              <w:tabs>
-                <w:tab w:val="clear" w:pos="708"/>
-                <w:tab w:val="left" w:pos="5771" w:leader="none"/>
-              </w:tabs>
-              <w:spacing w:before="0" w:after="0"/>
-              <w:jc w:val="left"/>
+                <w:rFonts w:ascii="Arial" w:eastAsia="Calibri" w:hAnsi="Arial" w:cs="Arial"/>
+                <w:sz w:val="44"/>
+                <w:szCs w:val="44"/>
+                <w:lang w:val="es-ES"/>
+              </w:rPr>
+              <w:t>${</w:t>
+            </w:r>
+            <w:proofErr w:type="spellStart"/>
+            <w:r>
+              <w:rPr>
+                <w:rFonts w:ascii="Arial" w:eastAsia="Calibri" w:hAnsi="Arial" w:cs="Arial"/>
+                <w:sz w:val="44"/>
+                <w:szCs w:val="44"/>
+                <w:lang w:val="es-ES"/>
+              </w:rPr>
+              <w:t>cliente_nombre</w:t>
+            </w:r>
+            <w:proofErr w:type="spellEnd"/>
+            <w:r>
+              <w:rPr>
+                <w:rFonts w:ascii="Arial" w:eastAsia="Calibri" w:hAnsi="Arial" w:cs="Arial"/>
+                <w:sz w:val="44"/>
+                <w:szCs w:val="44"/>
+                <w:lang w:val="es-ES"/>
+              </w:rPr>
+              <w:t>}</w:t>
+            </w:r>
+          </w:p>
+          <w:p>
+            <w:pPr>
+              <w:tabs>
+                <w:tab w:val="left" w:pos="5771"/>
+              </w:tabs>
               <w:rPr>
                 <w:rFonts w:ascii="Arial" w:hAnsi="Arial" w:cs="Arial"/>
                 <w:sz w:val="44"/>
@@ -223,155 +188,109 @@
                 <w:lang w:val="es-ES"/>
               </w:rPr>
             </w:pPr>
-            <w:r>
-              <w:rPr>
-                <w:rFonts w:eastAsia="Calibri" w:cs=""/>
-                <w:kern w:val="2"/>
-                <w:sz w:val="24"/>
-                <w:szCs w:val="24"/>
-                <w:lang w:val="es-CO" w:eastAsia="en-US" w:bidi="ar-SA"/>
-              </w:rPr>
-            </w:r>
           </w:p>
         </w:tc>
       </w:tr>
       <w:tr>
-        <w:trPr/>
         <w:tc>
           <w:tcPr>
             <w:tcW w:w="5987" w:type="dxa"/>
-            <w:vMerge w:val="continue"/>
-            <w:tcBorders/>
+            <w:vMerge/>
           </w:tcPr>
           <w:p>
             <w:pPr>
-              <w:pStyle w:val="Normal"/>
-              <w:widowControl/>
-              <w:tabs>
-                <w:tab w:val="clear" w:pos="708"/>
-                <w:tab w:val="left" w:pos="5771" w:leader="none"/>
-              </w:tabs>
-              <w:spacing w:before="0" w:after="0"/>
+              <w:tabs>
+                <w:tab w:val="left" w:pos="5771"/>
+              </w:tabs>
               <w:jc w:val="center"/>
               <w:rPr>
                 <w:lang w:val="es-ES"/>
               </w:rPr>
             </w:pPr>
-            <w:r>
-              <w:rPr>
-                <w:rFonts w:eastAsia="Calibri" w:cs=""/>
-                <w:kern w:val="2"/>
-                <w:sz w:val="24"/>
-                <w:szCs w:val="24"/>
-                <w:lang w:val="es-ES" w:eastAsia="en-US" w:bidi="ar-SA"/>
-              </w:rPr>
-            </w:r>
           </w:p>
         </w:tc>
         <w:tc>
           <w:tcPr>
             <w:tcW w:w="8402" w:type="dxa"/>
-            <w:tcBorders/>
           </w:tcPr>
           <w:p>
             <w:pPr>
-              <w:pStyle w:val="Normal"/>
-              <w:widowControl/>
-              <w:tabs>
-                <w:tab w:val="clear" w:pos="708"/>
-                <w:tab w:val="left" w:pos="5771" w:leader="none"/>
-              </w:tabs>
-              <w:spacing w:before="0" w:after="0"/>
-              <w:jc w:val="left"/>
-              <w:rPr>
-                <w:lang w:val="es-ES"/>
-              </w:rPr>
-            </w:pPr>
-            <w:r>
-              <w:rPr>
-                <w:rFonts w:eastAsia="Calibri" w:cs="Arial" w:ascii="Arial" w:hAnsi="Arial"/>
-                <w:kern w:val="2"/>
-                <w:sz w:val="44"/>
-                <w:szCs w:val="44"/>
-                <w:lang w:val="es-ES" w:eastAsia="en-US" w:bidi="ar-SA"/>
-              </w:rPr>
-              <w:t>${razon_social}</w:t>
-            </w:r>
-          </w:p>
-          <w:p>
-            <w:pPr>
-              <w:pStyle w:val="Normal"/>
-              <w:widowControl/>
-              <w:tabs>
-                <w:tab w:val="clear" w:pos="708"/>
-                <w:tab w:val="left" w:pos="5771" w:leader="none"/>
-              </w:tabs>
-              <w:spacing w:before="0" w:after="0"/>
-              <w:jc w:val="left"/>
-              <w:rPr>
-                <w:lang w:val="es-ES"/>
-              </w:rPr>
-            </w:pPr>
-            <w:r>
-              <w:rPr>
-                <w:rFonts w:eastAsia="Calibri" w:cs=""/>
-                <w:kern w:val="2"/>
-                <w:sz w:val="24"/>
-                <w:szCs w:val="24"/>
-                <w:lang w:val="es-CO" w:eastAsia="en-US" w:bidi="ar-SA"/>
-              </w:rPr>
-            </w:r>
+              <w:tabs>
+                <w:tab w:val="left" w:pos="5771"/>
+              </w:tabs>
+              <w:rPr>
+                <w:lang w:val="es-ES"/>
+              </w:rPr>
+            </w:pPr>
+            <w:r>
+              <w:rPr>
+                <w:rFonts w:ascii="Arial" w:eastAsia="Calibri" w:hAnsi="Arial" w:cs="Arial"/>
+                <w:sz w:val="44"/>
+                <w:szCs w:val="44"/>
+                <w:lang w:val="es-ES"/>
+              </w:rPr>
+              <w:t>${</w:t>
+            </w:r>
+            <w:proofErr w:type="spellStart"/>
+            <w:r>
+              <w:rPr>
+                <w:rFonts w:ascii="Arial" w:eastAsia="Calibri" w:hAnsi="Arial" w:cs="Arial"/>
+                <w:sz w:val="44"/>
+                <w:szCs w:val="44"/>
+                <w:lang w:val="es-ES"/>
+              </w:rPr>
+              <w:t>razon_social</w:t>
+            </w:r>
+            <w:proofErr w:type="spellEnd"/>
+            <w:r>
+              <w:rPr>
+                <w:rFonts w:ascii="Arial" w:eastAsia="Calibri" w:hAnsi="Arial" w:cs="Arial"/>
+                <w:sz w:val="44"/>
+                <w:szCs w:val="44"/>
+                <w:lang w:val="es-ES"/>
+              </w:rPr>
+              <w:t>}</w:t>
+            </w:r>
+          </w:p>
+          <w:p>
+            <w:pPr>
+              <w:tabs>
+                <w:tab w:val="left" w:pos="5771"/>
+              </w:tabs>
+              <w:rPr>
+                <w:lang w:val="es-ES"/>
+              </w:rPr>
+            </w:pPr>
           </w:p>
         </w:tc>
       </w:tr>
       <w:tr>
-        <w:trPr/>
         <w:tc>
           <w:tcPr>
             <w:tcW w:w="5987" w:type="dxa"/>
-            <w:vMerge w:val="continue"/>
-            <w:tcBorders/>
+            <w:vMerge/>
           </w:tcPr>
           <w:p>
             <w:pPr>
-              <w:pStyle w:val="Normal"/>
-              <w:widowControl/>
-              <w:tabs>
-                <w:tab w:val="clear" w:pos="708"/>
-                <w:tab w:val="left" w:pos="5771" w:leader="none"/>
-              </w:tabs>
-              <w:spacing w:before="0" w:after="0"/>
+              <w:tabs>
+                <w:tab w:val="left" w:pos="5771"/>
+              </w:tabs>
               <w:jc w:val="center"/>
               <w:rPr>
                 <w:lang w:val="es-ES"/>
               </w:rPr>
             </w:pPr>
-            <w:r>
-              <w:rPr>
-                <w:rFonts w:eastAsia="Calibri" w:cs=""/>
-                <w:kern w:val="2"/>
-                <w:sz w:val="24"/>
-                <w:szCs w:val="24"/>
-                <w:lang w:val="es-ES" w:eastAsia="en-US" w:bidi="ar-SA"/>
-              </w:rPr>
-            </w:r>
           </w:p>
         </w:tc>
         <w:tc>
           <w:tcPr>
             <w:tcW w:w="8402" w:type="dxa"/>
-            <w:tcBorders/>
           </w:tcPr>
           <w:p>
             <w:pPr>
-              <w:pStyle w:val="Normal"/>
-              <w:widowControl/>
-              <w:tabs>
-                <w:tab w:val="clear" w:pos="708"/>
-                <w:tab w:val="left" w:pos="5771" w:leader="none"/>
-              </w:tabs>
-              <w:spacing w:before="0" w:after="0"/>
-              <w:jc w:val="left"/>
+              <w:tabs>
+                <w:tab w:val="left" w:pos="5771"/>
+              </w:tabs>
               <w:rPr>
                 <w:rFonts w:ascii="Arial" w:hAnsi="Arial" w:cs="Arial"/>
                 <w:sz w:val="44"/>
@@ -381,25 +300,39 @@
             </w:pPr>
             <w:r>
               <w:rPr>
-                <w:rFonts w:eastAsia="Calibri" w:cs="Arial" w:ascii="Arial" w:hAnsi="Arial"/>
-                <w:kern w:val="2"/>
-                <w:sz w:val="44"/>
-                <w:szCs w:val="44"/>
-                <w:lang w:val="es-ES" w:eastAsia="en-US" w:bidi="ar-SA"/>
-              </w:rPr>
-              <w:t>${cliente_telefono}</w:t>
-            </w:r>
-          </w:p>
-          <w:p>
-            <w:pPr>
-              <w:pStyle w:val="Normal"/>
-              <w:widowControl/>
-              <w:tabs>
-                <w:tab w:val="clear" w:pos="708"/>
-                <w:tab w:val="left" w:pos="5771" w:leader="none"/>
-              </w:tabs>
-              <w:spacing w:before="0" w:after="0"/>
-              <w:jc w:val="left"/>
+                <w:rFonts w:ascii="Arial" w:eastAsia="Calibri" w:hAnsi="Arial" w:cs="Arial"/>
+                <w:sz w:val="44"/>
+                <w:szCs w:val="44"/>
+                <w:lang w:val="es-ES"/>
+              </w:rPr>
+              <w:t>${</w:t>
+            </w:r>
+            <w:proofErr w:type="spellStart"/>
+            <w:r>
+              <w:rPr>
+                <w:rFonts w:ascii="Arial" w:eastAsia="Calibri" w:hAnsi="Arial" w:cs="Arial"/>
+                <w:sz w:val="44"/>
+                <w:szCs w:val="44"/>
+                <w:lang w:val="es-ES"/>
+              </w:rPr>
+              <w:t>cliente_telefono</w:t>
+            </w:r>
+            <w:proofErr w:type="spellEnd"/>
+            <w:r>
+              <w:rPr>
+                <w:rFonts w:ascii="Arial" w:eastAsia="Calibri" w:hAnsi="Arial" w:cs="Arial"/>
+                <w:sz w:val="44"/>
+                <w:szCs w:val="44"/>
+                <w:lang w:val="es-ES"/>
+              </w:rPr>
+              <w:t>}</w:t>
+            </w:r>
+          </w:p>
+          <w:p>
+            <w:pPr>
+              <w:tabs>
+                <w:tab w:val="left" w:pos="5771"/>
+              </w:tabs>
               <w:rPr>
                 <w:rFonts w:ascii="Arial" w:hAnsi="Arial" w:cs="Arial"/>
                 <w:sz w:val="44"/>
@@ -407,68 +340,39 @@
                 <w:lang w:val="es-ES"/>
               </w:rPr>
             </w:pPr>
-            <w:r>
-              <w:rPr>
-                <w:rFonts w:eastAsia="Calibri" w:cs=""/>
-                <w:kern w:val="2"/>
-                <w:sz w:val="24"/>
-                <w:szCs w:val="24"/>
-                <w:lang w:val="es-CO" w:eastAsia="en-US" w:bidi="ar-SA"/>
-              </w:rPr>
-            </w:r>
           </w:p>
         </w:tc>
       </w:tr>
       <w:tr>
         <w:trPr>
-          <w:trHeight w:val="942" w:hRule="atLeast"/>
+          <w:trHeight w:val="942"/>
         </w:trPr>
         <w:tc>
           <w:tcPr>
             <w:tcW w:w="5987" w:type="dxa"/>
-            <w:vMerge w:val="continue"/>
-            <w:tcBorders/>
+            <w:vMerge/>
           </w:tcPr>
           <w:p>
             <w:pPr>
-              <w:pStyle w:val="Normal"/>
-              <w:widowControl/>
-              <w:tabs>
-                <w:tab w:val="clear" w:pos="708"/>
-                <w:tab w:val="left" w:pos="5771" w:leader="none"/>
-              </w:tabs>
-              <w:spacing w:before="0" w:after="0"/>
+              <w:tabs>
+                <w:tab w:val="left" w:pos="5771"/>
+              </w:tabs>
               <w:jc w:val="center"/>
               <w:rPr>
                 <w:lang w:val="es-ES"/>
               </w:rPr>
             </w:pPr>
-            <w:r>
-              <w:rPr>
-                <w:rFonts w:eastAsia="Calibri" w:cs=""/>
-                <w:kern w:val="2"/>
-                <w:sz w:val="24"/>
-                <w:szCs w:val="24"/>
-                <w:lang w:val="es-ES" w:eastAsia="en-US" w:bidi="ar-SA"/>
-              </w:rPr>
-            </w:r>
           </w:p>
         </w:tc>
         <w:tc>
           <w:tcPr>
             <w:tcW w:w="8402" w:type="dxa"/>
-            <w:tcBorders/>
           </w:tcPr>
           <w:p>
             <w:pPr>
-              <w:pStyle w:val="Normal"/>
-              <w:widowControl/>
-              <w:tabs>
-                <w:tab w:val="clear" w:pos="708"/>
-                <w:tab w:val="left" w:pos="5771" w:leader="none"/>
-              </w:tabs>
-              <w:spacing w:before="0" w:after="0"/>
-              <w:jc w:val="left"/>
+              <w:tabs>
+                <w:tab w:val="left" w:pos="5771"/>
+              </w:tabs>
               <w:rPr>
                 <w:rFonts w:ascii="Arial" w:hAnsi="Arial" w:cs="Arial"/>
                 <w:sz w:val="44"/>
@@ -478,61 +382,91 @@
             </w:pPr>
             <w:r>
               <w:rPr>
-                <w:rFonts w:eastAsia="Calibri" w:cs="Arial" w:ascii="Arial" w:hAnsi="Arial"/>
-                <w:kern w:val="2"/>
-                <w:sz w:val="44"/>
-                <w:szCs w:val="44"/>
-                <w:lang w:val="es-ES" w:eastAsia="en-US" w:bidi="ar-SA"/>
-              </w:rPr>
-              <w:t>${cliente_direccion}</w:t>
+                <w:rFonts w:ascii="Arial" w:eastAsia="Calibri" w:hAnsi="Arial" w:cs="Arial"/>
+                <w:sz w:val="44"/>
+                <w:szCs w:val="44"/>
+                <w:lang w:val="es-ES"/>
+              </w:rPr>
+              <w:t>${</w:t>
+            </w:r>
+            <w:proofErr w:type="spellStart"/>
+            <w:r>
+              <w:rPr>
+                <w:rFonts w:ascii="Arial" w:eastAsia="Calibri" w:hAnsi="Arial" w:cs="Arial"/>
+                <w:sz w:val="44"/>
+                <w:szCs w:val="44"/>
+                <w:lang w:val="es-ES"/>
+              </w:rPr>
+              <w:t>cliente_direccion</w:t>
+            </w:r>
+            <w:proofErr w:type="spellEnd"/>
+            <w:r>
+              <w:rPr>
+                <w:rFonts w:ascii="Arial" w:eastAsia="Calibri" w:hAnsi="Arial" w:cs="Arial"/>
+                <w:sz w:val="44"/>
+                <w:szCs w:val="44"/>
+                <w:lang w:val="es-ES"/>
+              </w:rPr>
+              <w:t>}</w:t>
             </w:r>
           </w:p>
         </w:tc>
       </w:tr>
       <w:tr>
         <w:trPr>
-          <w:trHeight w:val="581" w:hRule="atLeast"/>
+          <w:trHeight w:val="581"/>
         </w:trPr>
         <w:tc>
           <w:tcPr>
             <w:tcW w:w="14389" w:type="dxa"/>
             <w:gridSpan w:val="2"/>
-            <w:tcBorders/>
           </w:tcPr>
           <w:p>
             <w:pPr>
-              <w:pStyle w:val="Normal"/>
-              <w:widowControl/>
-              <w:tabs>
-                <w:tab w:val="clear" w:pos="708"/>
-                <w:tab w:val="left" w:pos="5771" w:leader="none"/>
-              </w:tabs>
-              <w:spacing w:before="0" w:after="0"/>
-              <w:jc w:val="left"/>
-              <w:rPr>
-                <w:rFonts w:ascii="Calibri" w:hAnsi="Calibri" w:eastAsia="Calibri" w:cs=""/>
-                <w:kern w:val="2"/>
+              <w:tabs>
+                <w:tab w:val="left" w:pos="5771"/>
+              </w:tabs>
+              <w:rPr>
+                <w:rFonts w:ascii="Calibri" w:eastAsia="Calibri" w:hAnsi="Calibri"/>
                 <w:sz w:val="64"/>
                 <w:szCs w:val="64"/>
-                <w:lang w:val="es-CO" w:eastAsia="en-US" w:bidi="ar-SA"/>
-              </w:rPr>
-            </w:pPr>
-            <w:r>
-              <w:rPr>
-                <w:rFonts w:eastAsia="Calibri" w:cs="Arial" w:ascii="Arial" w:hAnsi="Arial"/>
-                <w:kern w:val="2"/>
+              </w:rPr>
+            </w:pPr>
+            <w:r>
+              <w:rPr>
+                <w:rFonts w:ascii="Arial" w:eastAsia="Calibri" w:hAnsi="Arial" w:cs="Arial"/>
                 <w:sz w:val="64"/>
                 <w:szCs w:val="64"/>
-                <w:lang w:val="es-ES" w:eastAsia="en-US" w:bidi="ar-SA"/>
-              </w:rPr>
-              <w:t>${prefijo} - ${n_factura}</w:t>
+                <w:lang w:val="es-ES"/>
+              </w:rPr>
+              <w:t>${prefijo} - ${</w:t>
+            </w:r>
+            <w:proofErr w:type="spellStart"/>
+            <w:r>
+              <w:rPr>
+                <w:rFonts w:ascii="Arial" w:eastAsia="Calibri" w:hAnsi="Arial" w:cs="Arial"/>
+                <w:sz w:val="64"/>
+                <w:szCs w:val="64"/>
+                <w:lang w:val="es-ES"/>
+              </w:rPr>
+              <w:t>n_factura</w:t>
+            </w:r>
+            <w:proofErr w:type="spellEnd"/>
+            <w:r>
+              <w:rPr>
+                <w:rFonts w:ascii="Arial" w:eastAsia="Calibri" w:hAnsi="Arial" w:cs="Arial"/>
+                <w:sz w:val="64"/>
+                <w:szCs w:val="64"/>
+                <w:lang w:val="es-ES"/>
+              </w:rPr>
+              <w:t>}</w:t>
             </w:r>
           </w:p>
         </w:tc>
       </w:tr>
       <w:tr>
         <w:trPr>
-          <w:trHeight w:val="581" w:hRule="atLeast"/>
+          <w:trHeight w:val="581"/>
         </w:trPr>
         <w:tc>
           <w:tcPr>
@@ -544,29 +478,21 @@
           </w:tcPr>
           <w:p>
             <w:pPr>
-              <w:pStyle w:val="Normal"/>
-              <w:widowControl/>
-              <w:tabs>
-                <w:tab w:val="clear" w:pos="708"/>
-                <w:tab w:val="left" w:pos="5771" w:leader="none"/>
-              </w:tabs>
-              <w:spacing w:before="0" w:after="0"/>
-              <w:jc w:val="left"/>
-              <w:rPr>
-                <w:rFonts w:ascii="Calibri" w:hAnsi="Calibri" w:eastAsia="Calibri" w:cs=""/>
-                <w:kern w:val="2"/>
+              <w:tabs>
+                <w:tab w:val="left" w:pos="5771"/>
+              </w:tabs>
+              <w:rPr>
+                <w:rFonts w:ascii="Calibri" w:eastAsia="Calibri" w:hAnsi="Calibri"/>
                 <w:sz w:val="64"/>
                 <w:szCs w:val="64"/>
-                <w:lang w:val="es-CO" w:eastAsia="en-US" w:bidi="ar-SA"/>
-              </w:rPr>
-            </w:pPr>
-            <w:r>
-              <w:rPr>
-                <w:rFonts w:eastAsia="Calibri" w:cs="Arial" w:ascii="Arial" w:hAnsi="Arial"/>
-                <w:kern w:val="2"/>
+              </w:rPr>
+            </w:pPr>
+            <w:r>
+              <w:rPr>
+                <w:rFonts w:ascii="Arial" w:eastAsia="Calibri" w:hAnsi="Arial" w:cs="Arial"/>
                 <w:sz w:val="64"/>
                 <w:szCs w:val="64"/>
-                <w:lang w:val="es-ES" w:eastAsia="en-US" w:bidi="ar-SA"/>
+                <w:lang w:val="es-ES"/>
               </w:rPr>
               <w:t>${ciudad}</w:t>
             </w:r>
@@ -575,7 +501,7 @@
       </w:tr>
       <w:tr>
         <w:trPr>
-          <w:trHeight w:val="581" w:hRule="atLeast"/>
+          <w:trHeight w:val="581"/>
         </w:trPr>
         <w:tc>
           <w:tcPr>
@@ -587,29 +513,21 @@
           </w:tcPr>
           <w:p>
             <w:pPr>
-              <w:pStyle w:val="Normal"/>
-              <w:widowControl/>
-              <w:tabs>
-                <w:tab w:val="clear" w:pos="708"/>
-                <w:tab w:val="left" w:pos="5771" w:leader="none"/>
-              </w:tabs>
-              <w:spacing w:before="0" w:after="0"/>
-              <w:jc w:val="left"/>
-              <w:rPr>
-                <w:rFonts w:ascii="Calibri" w:hAnsi="Calibri" w:eastAsia="Calibri" w:cs=""/>
-                <w:kern w:val="2"/>
+              <w:tabs>
+                <w:tab w:val="left" w:pos="5771"/>
+              </w:tabs>
+              <w:rPr>
+                <w:rFonts w:ascii="Calibri" w:eastAsia="Calibri" w:hAnsi="Calibri"/>
                 <w:sz w:val="64"/>
                 <w:szCs w:val="64"/>
-                <w:lang w:val="es-CO" w:eastAsia="en-US" w:bidi="ar-SA"/>
-              </w:rPr>
-            </w:pPr>
-            <w:r>
-              <w:rPr>
-                <w:rFonts w:eastAsia="Calibri" w:cs="Arial" w:ascii="Arial" w:hAnsi="Arial"/>
-                <w:kern w:val="2"/>
+              </w:rPr>
+            </w:pPr>
+            <w:r>
+              <w:rPr>
+                <w:rFonts w:ascii="Arial" w:eastAsia="Calibri" w:hAnsi="Arial" w:cs="Arial"/>
                 <w:sz w:val="64"/>
                 <w:szCs w:val="64"/>
-                <w:lang w:val="es-ES" w:eastAsia="en-US" w:bidi="ar-SA"/>
+                <w:lang w:val="es-ES"/>
               </w:rPr>
               <w:t>${observaciones}</w:t>
             </w:r>
@@ -618,35 +536,28 @@
       </w:tr>
       <w:tr>
         <w:trPr>
-          <w:trHeight w:val="1117" w:hRule="atLeast"/>
+          <w:trHeight w:val="1117"/>
         </w:trPr>
         <w:tc>
           <w:tcPr>
             <w:tcW w:w="14389" w:type="dxa"/>
             <w:gridSpan w:val="2"/>
-            <w:tcBorders/>
           </w:tcPr>
           <w:p>
             <w:pPr>
-              <w:pStyle w:val="Normal"/>
-              <w:widowControl/>
-              <w:tabs>
-                <w:tab w:val="clear" w:pos="708"/>
-                <w:tab w:val="left" w:pos="5771" w:leader="none"/>
-              </w:tabs>
-              <w:spacing w:before="0" w:after="0"/>
-              <w:jc w:val="left"/>
-              <w:rPr>
-                <w:lang w:val="es-ES"/>
-              </w:rPr>
-            </w:pPr>
-            <w:r>
-              <w:rPr>
-                <w:rFonts w:eastAsia="Calibri" w:cs="Arial" w:ascii="Arial" w:hAnsi="Arial"/>
-                <w:kern w:val="2"/>
+              <w:tabs>
+                <w:tab w:val="left" w:pos="5771"/>
+              </w:tabs>
+              <w:rPr>
+                <w:lang w:val="es-ES"/>
+              </w:rPr>
+            </w:pPr>
+            <w:r>
+              <w:rPr>
+                <w:rFonts w:ascii="Arial" w:eastAsia="Calibri" w:hAnsi="Arial" w:cs="Arial"/>
                 <w:sz w:val="72"/>
                 <w:szCs w:val="72"/>
-                <w:lang w:val="es-ES" w:eastAsia="en-US" w:bidi="ar-SA"/>
+                <w:lang w:val="es-ES"/>
               </w:rPr>
               <w:t>${e}: ${n} / ${t}</w:t>
             </w:r>
@@ -656,40 +567,31 @@
     </w:tbl>
     <w:p>
       <w:pPr>
-        <w:pStyle w:val="Normal"/>
         <w:tabs>
-          <w:tab w:val="clear" w:pos="708"/>
-          <w:tab w:val="left" w:pos="5771" w:leader="none"/>
+          <w:tab w:val="left" w:pos="5771"/>
         </w:tabs>
         <w:rPr>
           <w:lang w:val="es-ES"/>
         </w:rPr>
       </w:pPr>
-      <w:r>
-        <w:rPr>
-          <w:lang w:val="es-ES"/>
-        </w:rPr>
-      </w:r>
     </w:p>
     <w:sectPr>
-      <w:type w:val="nextPage"/>
-      <w:pgSz w:orient="landscape" w:w="15840" w:h="12240"/>
-      <w:pgMar w:left="720" w:right="720" w:gutter="0" w:header="0" w:top="720" w:footer="0" w:bottom="720"/>
-      <w:pgNumType w:fmt="decimal"/>
-      <w:formProt w:val="false"/>
-      <w:textDirection w:val="lrTb"/>
-      <w:docGrid w:type="default" w:linePitch="360" w:charSpace="0"/>
+      <w:pgSz w:w="15840" w:h="12240" w:orient="landscape"/>
+      <w:pgMar w:top="720" w:right="720" w:bottom="720" w:left="720" w:header="0" w:footer="0" w:gutter="0"/>
+      <w:cols w:space="720"/>
+      <w:formProt w:val="0"/>
+      <w:docGrid w:linePitch="360"/>
     </w:sectPr>
   </w:body>
 </w:document>
 </file>
 
 <file path=word/styles.xml><?xml version="1.0" encoding="utf-8"?>
-<w:styles xmlns:w="http://schemas.openxmlformats.org/wordprocessingml/2006/main" xmlns:w14="http://schemas.microsoft.com/office/word/2010/wordml" xmlns:mc="http://schemas.openxmlformats.org/markup-compatibility/2006" mc:Ignorable="w14">
+<w:styles xmlns:mc="http://schemas.openxmlformats.org/markup-compatibility/2006" xmlns:r="http://schemas.openxmlformats.org/officeDocument/2006/relationships" xmlns:w="http://schemas.openxmlformats.org/wordprocessingml/2006/main" xmlns:w14="http://schemas.microsoft.com/office/word/2010/wordml" xmlns:w15="http://schemas.microsoft.com/office/word/2012/wordml" xmlns:w16cex="http://schemas.microsoft.com/office/word/2018/wordml/cex" xmlns:w16cid="http://schemas.microsoft.com/office/word/2016/wordml/cid" xmlns:w16="http://schemas.microsoft.com/office/word/2018/wordml" xmlns:w16du="http://schemas.microsoft.com/office/word/2023/wordml/word16du" xmlns:w16sdtdh="http://schemas.microsoft.com/office/word/2020/wordml/sdtdatahash" xmlns:w16sdtfl="http://schemas.microsoft.com/office/word/2024/wordml/sdtformatlock" xmlns:w16se="http://schemas.microsoft.com/office/word/2015/wordml/symex" mc:Ignorable="w14 w15 w16se w16cid w16 w16cex w16sdtdh w16sdtfl w16du">
   <w:docDefaults>
     <w:rPrDefault>
       <w:rPr>
-        <w:rFonts w:ascii="Calibri" w:hAnsi="Calibri" w:eastAsia="Calibri" w:cs="" w:asciiTheme="minorHAnsi" w:cstheme="minorBidi" w:eastAsiaTheme="minorHAnsi" w:hAnsiTheme="minorHAnsi"/>
+        <w:rFonts w:asciiTheme="minorHAnsi" w:eastAsiaTheme="minorHAnsi" w:hAnsiTheme="minorHAnsi" w:cstheme="minorBidi"/>
         <w:kern w:val="2"/>
         <w:sz w:val="24"/>
         <w:szCs w:val="24"/>
@@ -699,21 +601,21 @@
     </w:rPrDefault>
     <w:pPrDefault>
       <w:pPr>
-        <w:suppressAutoHyphens w:val="true"/>
+        <w:suppressAutoHyphens/>
       </w:pPr>
     </w:pPrDefault>
   </w:docDefaults>
   <w:latentStyles w:defLockedState="0" w:defUIPriority="99" w:defSemiHidden="0" w:defUnhideWhenUsed="0" w:defQFormat="0" w:count="376">
     <w:lsdException w:name="Normal" w:uiPriority="0" w:qFormat="1"/>
     <w:lsdException w:name="heading 1" w:uiPriority="9" w:qFormat="1"/>
-    <w:lsdException w:name="heading 2" w:uiPriority="9" w:semiHidden="1" w:unhideWhenUsed="1" w:qFormat="1"/>
-    <w:lsdException w:name="heading 3" w:uiPriority="9" w:semiHidden="1" w:unhideWhenUsed="1" w:qFormat="1"/>
-    <w:lsdException w:name="heading 4" w:uiPriority="9" w:semiHidden="1" w:unhideWhenUsed="1" w:qFormat="1"/>
-    <w:lsdException w:name="heading 5" w:uiPriority="9" w:semiHidden="1" w:unhideWhenUsed="1" w:qFormat="1"/>
-    <w:lsdException w:name="heading 6" w:uiPriority="9" w:semiHidden="1" w:unhideWhenUsed="1" w:qFormat="1"/>
-    <w:lsdException w:name="heading 7" w:uiPriority="9" w:semiHidden="1" w:unhideWhenUsed="1" w:qFormat="1"/>
-    <w:lsdException w:name="heading 8" w:uiPriority="9" w:semiHidden="1" w:unhideWhenUsed="1" w:qFormat="1"/>
-    <w:lsdException w:name="heading 9" w:uiPriority="9" w:semiHidden="1" w:unhideWhenUsed="1" w:qFormat="1"/>
+    <w:lsdException w:name="heading 2" w:semiHidden="1" w:uiPriority="9" w:unhideWhenUsed="1" w:qFormat="1"/>
+    <w:lsdException w:name="heading 3" w:semiHidden="1" w:uiPriority="9" w:unhideWhenUsed="1" w:qFormat="1"/>
+    <w:lsdException w:name="heading 4" w:semiHidden="1" w:uiPriority="9" w:unhideWhenUsed="1" w:qFormat="1"/>
+    <w:lsdException w:name="heading 5" w:semiHidden="1" w:uiPriority="9" w:unhideWhenUsed="1" w:qFormat="1"/>
+    <w:lsdException w:name="heading 6" w:semiHidden="1" w:uiPriority="9" w:unhideWhenUsed="1" w:qFormat="1"/>
+    <w:lsdException w:name="heading 7" w:semiHidden="1" w:uiPriority="9" w:unhideWhenUsed="1" w:qFormat="1"/>
+    <w:lsdException w:name="heading 8" w:semiHidden="1" w:uiPriority="9" w:unhideWhenUsed="1" w:qFormat="1"/>
+    <w:lsdException w:name="heading 9" w:semiHidden="1" w:uiPriority="9" w:unhideWhenUsed="1" w:qFormat="1"/>
     <w:lsdException w:name="index 1" w:semiHidden="1" w:unhideWhenUsed="1"/>
     <w:lsdException w:name="index 2" w:semiHidden="1" w:unhideWhenUsed="1"/>
     <w:lsdException w:name="index 3" w:semiHidden="1" w:unhideWhenUsed="1"/>
@@ -723,22 +625,22 @@
     <w:lsdException w:name="index 7" w:semiHidden="1" w:unhideWhenUsed="1"/>
     <w:lsdException w:name="index 8" w:semiHidden="1" w:unhideWhenUsed="1"/>
     <w:lsdException w:name="index 9" w:semiHidden="1" w:unhideWhenUsed="1"/>
-    <w:lsdException w:name="toc 1" w:uiPriority="39" w:semiHidden="1" w:unhideWhenUsed="1"/>
-    <w:lsdException w:name="toc 2" w:uiPriority="39" w:semiHidden="1" w:unhideWhenUsed="1"/>
-    <w:lsdException w:name="toc 3" w:uiPriority="39" w:semiHidden="1" w:unhideWhenUsed="1"/>
-    <w:lsdException w:name="toc 4" w:uiPriority="39" w:semiHidden="1" w:unhideWhenUsed="1"/>
-    <w:lsdException w:name="toc 5" w:uiPriority="39" w:semiHidden="1" w:unhideWhenUsed="1"/>
-    <w:lsdException w:name="toc 6" w:uiPriority="39" w:semiHidden="1" w:unhideWhenUsed="1"/>
-    <w:lsdException w:name="toc 7" w:uiPriority="39" w:semiHidden="1" w:unhideWhenUsed="1"/>
-    <w:lsdException w:name="toc 8" w:uiPriority="39" w:semiHidden="1" w:unhideWhenUsed="1"/>
-    <w:lsdException w:name="toc 9" w:uiPriority="39" w:semiHidden="1" w:unhideWhenUsed="1"/>
+    <w:lsdException w:name="toc 1" w:semiHidden="1" w:uiPriority="39" w:unhideWhenUsed="1"/>
+    <w:lsdException w:name="toc 2" w:semiHidden="1" w:uiPriority="39" w:unhideWhenUsed="1"/>
+    <w:lsdException w:name="toc 3" w:semiHidden="1" w:uiPriority="39" w:unhideWhenUsed="1"/>
+    <w:lsdException w:name="toc 4" w:semiHidden="1" w:uiPriority="39" w:unhideWhenUsed="1"/>
+    <w:lsdException w:name="toc 5" w:semiHidden="1" w:uiPriority="39" w:unhideWhenUsed="1"/>
+    <w:lsdException w:name="toc 6" w:semiHidden="1" w:uiPriority="39" w:unhideWhenUsed="1"/>
+    <w:lsdException w:name="toc 7" w:semiHidden="1" w:uiPriority="39" w:unhideWhenUsed="1"/>
+    <w:lsdException w:name="toc 8" w:semiHidden="1" w:uiPriority="39" w:unhideWhenUsed="1"/>
+    <w:lsdException w:name="toc 9" w:semiHidden="1" w:uiPriority="39" w:unhideWhenUsed="1"/>
     <w:lsdException w:name="Normal Indent" w:semiHidden="1" w:unhideWhenUsed="1"/>
     <w:lsdException w:name="footnote text" w:semiHidden="1" w:unhideWhenUsed="1"/>
     <w:lsdException w:name="annotation text" w:semiHidden="1" w:unhideWhenUsed="1"/>
     <w:lsdException w:name="header" w:semiHidden="1" w:unhideWhenUsed="1"/>
     <w:lsdException w:name="footer" w:semiHidden="1" w:unhideWhenUsed="1"/>
     <w:lsdException w:name="index heading" w:semiHidden="1" w:unhideWhenUsed="1"/>
-    <w:lsdException w:name="caption" w:uiPriority="35" w:semiHidden="1" w:unhideWhenUsed="1" w:qFormat="1"/>
+    <w:lsdException w:name="caption" w:semiHidden="1" w:uiPriority="35" w:unhideWhenUsed="1" w:qFormat="1"/>
     <w:lsdException w:name="table of figures" w:semiHidden="1" w:unhideWhenUsed="1"/>
     <w:lsdException w:name="envelope address" w:semiHidden="1" w:unhideWhenUsed="1"/>
     <w:lsdException w:name="envelope return" w:semiHidden="1" w:unhideWhenUsed="1"/>
@@ -769,7 +671,7 @@
     <w:lsdException w:name="Title" w:uiPriority="10" w:qFormat="1"/>
     <w:lsdException w:name="Closing" w:semiHidden="1" w:unhideWhenUsed="1"/>
     <w:lsdException w:name="Signature" w:semiHidden="1" w:unhideWhenUsed="1"/>
-    <w:lsdException w:name="Default Paragraph Font" w:uiPriority="1" w:semiHidden="1" w:unhideWhenUsed="1"/>
+    <w:lsdException w:name="Default Paragraph Font" w:semiHidden="1" w:uiPriority="1" w:unhideWhenUsed="1"/>
     <w:lsdException w:name="Body Text" w:semiHidden="1" w:unhideWhenUsed="1"/>
     <w:lsdException w:name="Body Text Indent" w:semiHidden="1" w:unhideWhenUsed="1"/>
     <w:lsdException w:name="List Continue" w:semiHidden="1" w:unhideWhenUsed="1"/>
@@ -969,8 +871,8 @@
     <w:lsdException w:name="Subtle Reference" w:uiPriority="31" w:qFormat="1"/>
     <w:lsdException w:name="Intense Reference" w:uiPriority="32" w:qFormat="1"/>
     <w:lsdException w:name="Book Title" w:uiPriority="33" w:qFormat="1"/>
-    <w:lsdException w:name="Bibliography" w:uiPriority="37" w:semiHidden="1" w:unhideWhenUsed="1"/>
-    <w:lsdException w:name="TOC Heading" w:uiPriority="39" w:semiHidden="1" w:unhideWhenUsed="1" w:qFormat="1"/>
+    <w:lsdException w:name="Bibliography" w:semiHidden="1" w:uiPriority="37" w:unhideWhenUsed="1"/>
+    <w:lsdException w:name="TOC Heading" w:semiHidden="1" w:uiPriority="39" w:unhideWhenUsed="1" w:qFormat="1"/>
     <w:lsdException w:name="Plain Table 1" w:uiPriority="41"/>
     <w:lsdException w:name="Plain Table 2" w:uiPriority="42"/>
     <w:lsdException w:name="Plain Table 3" w:uiPriority="43"/>
@@ -1081,66 +983,68 @@
     <w:lsdException w:name="Unresolved Mention" w:semiHidden="1" w:unhideWhenUsed="1"/>
     <w:lsdException w:name="Smart Link" w:semiHidden="1" w:unhideWhenUsed="1"/>
   </w:latentStyles>
-  <w:style w:type="paragraph" w:styleId="Normal" w:default="1">
+  <w:style w:type="paragraph" w:default="1" w:styleId="Normal">
     <w:name w:val="Normal"/>
     <w:qFormat/>
-    <w:pPr>
-      <w:widowControl/>
-      <w:bidi w:val="0"/>
-      <w:spacing w:before="0" w:after="0"/>
-      <w:jc w:val="left"/>
-    </w:pPr>
-    <w:rPr>
-      <w:rFonts w:ascii="Calibri" w:hAnsi="Calibri" w:eastAsia="Calibri" w:cs="" w:asciiTheme="minorHAnsi" w:cstheme="minorBidi" w:eastAsiaTheme="minorHAnsi" w:hAnsiTheme="minorHAnsi"/>
-      <w:color w:val="auto"/>
-      <w:kern w:val="2"/>
-      <w:sz w:val="24"/>
-      <w:szCs w:val="24"/>
-      <w:lang w:val="es-CO" w:eastAsia="en-US" w:bidi="ar-SA"/>
-      <w14:ligatures w14:val="standardContextual"/>
-    </w:rPr>
   </w:style>
-  <w:style w:type="character" w:styleId="DefaultParagraphFont" w:default="1">
+  <w:style w:type="character" w:default="1" w:styleId="Fuentedeprrafopredeter">
     <w:name w:val="Default Paragraph Font"/>
     <w:uiPriority w:val="1"/>
     <w:semiHidden/>
     <w:unhideWhenUsed/>
-    <w:qFormat/>
-    <w:rPr/>
+  </w:style>
+  <w:style w:type="table" w:default="1" w:styleId="Tablanormal">
+    <w:name w:val="Normal Table"/>
+    <w:uiPriority w:val="99"/>
+    <w:semiHidden/>
+    <w:unhideWhenUsed/>
+    <w:tblPr>
+      <w:tblInd w:w="0" w:type="dxa"/>
+      <w:tblCellMar>
+        <w:top w:w="0" w:type="dxa"/>
+        <w:left w:w="108" w:type="dxa"/>
+        <w:bottom w:w="0" w:type="dxa"/>
+        <w:right w:w="108" w:type="dxa"/>
+      </w:tblCellMar>
+    </w:tblPr>
+  </w:style>
+  <w:style w:type="numbering" w:default="1" w:styleId="Sinlista">
+    <w:name w:val="No List"/>
+    <w:uiPriority w:val="99"/>
+    <w:semiHidden/>
+    <w:unhideWhenUsed/>
   </w:style>
   <w:style w:type="paragraph" w:styleId="Ttulo">
-    <w:name w:val="Título"/>
+    <w:name w:val="Title"/>
     <w:basedOn w:val="Normal"/>
-    <w:next w:val="BodyText"/>
+    <w:next w:val="Textoindependiente"/>
     <w:qFormat/>
     <w:pPr>
-      <w:keepNext w:val="true"/>
+      <w:keepNext/>
       <w:spacing w:before="240" w:after="120"/>
     </w:pPr>
     <w:rPr>
-      <w:rFonts w:ascii="Liberation Sans" w:hAnsi="Liberation Sans" w:eastAsia="Microsoft YaHei" w:cs="Arial"/>
+      <w:rFonts w:ascii="Liberation Sans" w:eastAsia="Microsoft YaHei" w:hAnsi="Liberation Sans" w:cs="Arial"/>
       <w:sz w:val="28"/>
       <w:szCs w:val="28"/>
     </w:rPr>
   </w:style>
-  <w:style w:type="paragraph" w:styleId="BodyText">
+  <w:style w:type="paragraph" w:styleId="Textoindependiente">
     <w:name w:val="Body Text"/>
     <w:basedOn w:val="Normal"/>
     <w:pPr>
-      <w:spacing w:lineRule="auto" w:line="276" w:before="0" w:after="140"/>
+      <w:spacing w:after="140" w:line="276" w:lineRule="auto"/>
     </w:pPr>
-    <w:rPr/>
   </w:style>
-  <w:style w:type="paragraph" w:styleId="List">
+  <w:style w:type="paragraph" w:styleId="Lista">
     <w:name w:val="List"/>
-    <w:basedOn w:val="BodyText"/>
-    <w:pPr/>
+    <w:basedOn w:val="Textoindependiente"/>
     <w:rPr>
       <w:rFonts w:cs="Arial"/>
     </w:rPr>
   </w:style>
-  <w:style w:type="paragraph" w:styleId="Caption">
-    <w:name w:val="Caption"/>
+  <w:style w:type="paragraph" w:styleId="Descripcin">
+    <w:name w:val="caption"/>
     <w:basedOn w:val="Normal"/>
     <w:qFormat/>
     <w:pPr>
@@ -1151,11 +1055,9 @@
       <w:rFonts w:cs="Arial"/>
       <w:i/>
       <w:iCs/>
-      <w:sz w:val="24"/>
-      <w:szCs w:val="24"/>
     </w:rPr>
   </w:style>
-  <w:style w:type="paragraph" w:styleId="Ndice">
+  <w:style w:type="paragraph" w:customStyle="1" w:styleId="ndice">
     <w:name w:val="Índice"/>
     <w:basedOn w:val="Normal"/>
     <w:qFormat/>
@@ -1166,47 +1068,24 @@
       <w:rFonts w:cs="Arial"/>
     </w:rPr>
   </w:style>
-  <w:style w:type="paragraph" w:styleId="Contenidodelmarco">
+  <w:style w:type="paragraph" w:customStyle="1" w:styleId="Contenidodelmarco">
     <w:name w:val="Contenido del marco"/>
     <w:basedOn w:val="Normal"/>
     <w:qFormat/>
-    <w:pPr/>
-    <w:rPr/>
-  </w:style>
-  <w:style w:type="numbering" w:styleId="NoList" w:default="1">
-    <w:name w:val="No List"/>
-    <w:uiPriority w:val="99"/>
-    <w:semiHidden/>
-    <w:unhideWhenUsed/>
-    <w:qFormat/>
-  </w:style>
-  <w:style w:type="table" w:default="1" w:styleId="Tablanormal">
-    <w:name w:val="Normal Table"/>
-    <w:uiPriority w:val="99"/>
-    <w:semiHidden/>
-    <w:unhideWhenUsed/>
-    <w:tblPr>
-      <w:tblCellMar>
-        <w:top w:w="0" w:type="dxa"/>
-        <w:left w:w="108" w:type="dxa"/>
-        <w:bottom w:w="0" w:type="dxa"/>
-        <w:right w:w="108" w:type="dxa"/>
-      </w:tblCellMar>
-    </w:tblPr>
   </w:style>
   <w:style w:type="table" w:styleId="Tablaconcuadrcula">
     <w:name w:val="Table Grid"/>
     <w:basedOn w:val="Tablanormal"/>
     <w:uiPriority w:val="39"/>
-    <w:rsid w:val="00c90c81"/>
+    <w:rsid w:val="00C90C81"/>
     <w:tblPr>
       <w:tblBorders>
-        <w:top w:val="single" w:color="auto" w:sz="4" w:space="0"/>
-        <w:left w:val="single" w:color="auto" w:sz="4" w:space="0"/>
-        <w:bottom w:val="single" w:color="auto" w:sz="4" w:space="0"/>
-        <w:right w:val="single" w:color="auto" w:sz="4" w:space="0"/>
-        <w:insideH w:val="single" w:color="auto" w:sz="4" w:space="0"/>
-        <w:insideV w:val="single" w:color="auto" w:sz="4" w:space="0"/>
+        <w:top w:val="single" w:sz="4" w:space="0" w:color="auto"/>
+        <w:left w:val="single" w:sz="4" w:space="0" w:color="auto"/>
+        <w:bottom w:val="single" w:sz="4" w:space="0" w:color="auto"/>
+        <w:right w:val="single" w:sz="4" w:space="0" w:color="auto"/>
+        <w:insideH w:val="single" w:sz="4" w:space="0" w:color="auto"/>
+        <w:insideV w:val="single" w:sz="4" w:space="0" w:color="auto"/>
       </w:tblBorders>
     </w:tblPr>
   </w:style>
@@ -1214,54 +1093,54 @@
 </file>
 
 <file path=word/theme/theme1.xml><?xml version="1.0" encoding="utf-8"?>
-<a:theme xmlns:a="http://schemas.openxmlformats.org/drawingml/2006/main" xmlns:r="http://schemas.openxmlformats.org/officeDocument/2006/relationships" name="Tema de Office">
+<a:theme xmlns:a="http://schemas.openxmlformats.org/drawingml/2006/main" name="Tema de Office">
   <a:themeElements>
     <a:clrScheme name="Office">
       <a:dk1>
         <a:srgbClr val="000000"/>
       </a:dk1>
       <a:lt1>
-        <a:srgbClr val="ffffff"/>
+        <a:srgbClr val="FFFFFF"/>
       </a:lt1>
       <a:dk2>
-        <a:srgbClr val="44546a"/>
+        <a:srgbClr val="44546A"/>
       </a:dk2>
       <a:lt2>
-        <a:srgbClr val="e7e6e6"/>
+        <a:srgbClr val="E7E6E6"/>
       </a:lt2>
       <a:accent1>
-        <a:srgbClr val="4472c4"/>
+        <a:srgbClr val="4472C4"/>
       </a:accent1>
       <a:accent2>
-        <a:srgbClr val="ed7d31"/>
+        <a:srgbClr val="ED7D31"/>
       </a:accent2>
       <a:accent3>
-        <a:srgbClr val="a5a5a5"/>
+        <a:srgbClr val="A5A5A5"/>
       </a:accent3>
       <a:accent4>
-        <a:srgbClr val="ffc000"/>
+        <a:srgbClr val="FFC000"/>
       </a:accent4>
       <a:accent5>
-        <a:srgbClr val="5b9bd5"/>
+        <a:srgbClr val="5B9BD5"/>
       </a:accent5>
       <a:accent6>
-        <a:srgbClr val="70ad47"/>
+        <a:srgbClr val="70AD47"/>
       </a:accent6>
       <a:hlink>
-        <a:srgbClr val="0563c1"/>
+        <a:srgbClr val="0563C1"/>
       </a:hlink>
       <a:folHlink>
-        <a:srgbClr val="954f72"/>
+        <a:srgbClr val="954F72"/>
       </a:folHlink>
     </a:clrScheme>
     <a:fontScheme name="Office">
       <a:majorFont>
-        <a:latin typeface="Calibri Light" panose="020F0302020204030204" pitchFamily="0" charset="1"/>
+        <a:latin typeface="Calibri Light" panose="020F0302020204030204"/>
         <a:ea typeface=""/>
         <a:cs typeface=""/>
       </a:majorFont>
       <a:minorFont>
-        <a:latin typeface="Calibri" panose="020F0502020204030204" pitchFamily="0" charset="1"/>
+        <a:latin typeface="Calibri" panose="020F0502020204030204"/>
         <a:ea typeface=""/>
         <a:cs typeface=""/>
       </a:minorFont>
@@ -1293,7 +1172,7 @@
             </a:gs>
           </a:gsLst>
           <a:lin ang="5400000" scaled="0"/>
-          <a:tileRect l="0" t="0" r="0" b="0"/>
+          <a:tileRect/>
         </a:gradFill>
         <a:gradFill>
           <a:gsLst>
@@ -1317,7 +1196,7 @@
             </a:gs>
           </a:gsLst>
           <a:lin ang="5400000" scaled="0"/>
-          <a:tileRect l="0" t="0" r="0" b="0"/>
+          <a:tileRect/>
         </a:gradFill>
       </a:fillStyleLst>
       <a:lnStyleLst>
@@ -1377,10 +1256,12 @@
             </a:gs>
           </a:gsLst>
           <a:lin ang="5400000" scaled="0"/>
-          <a:tileRect l="0" t="0" r="0" b="0"/>
+          <a:tileRect/>
         </a:gradFill>
       </a:bgFillStyleLst>
     </a:fmtScheme>
   </a:themeElements>
+  <a:objectDefaults/>
+  <a:extraClrSchemeLst/>
 </a:theme>
 </file>
</xml_diff>